<commit_message>
Update Honorary Chairs and Technical Program Chairs per convener's message
Replace Hari Mohan Rai and AKM Bahalul Haque with Narayan Debnath (Eastern
International University, Vietnam) and Bhuvanesh Unhelkar (University of
South Florida, USA) as Honorary Chairs, reordered per the convener's
specified sequence: Debnath, Unhelkar, Dac-Nhuong Le, Jafar A. Alzubi,
Fateh Mebarek-Oudina, Yaroslav D. Sergeyev.

Fill 3 of the 4 open International Technical Program Chair slots with
Keith Sherringham, Yu-Chen Hu and Samiya Khan, reusing their existing
keynote speaker profile data.

Co-Authored-By: Claude Sonnet 5 <noreply@anthropic.com>
</commit_message>
<xml_diff>
--- a/assets/downloads/ICNGCI-2026-Conference-Information.docx
+++ b/assets/downloads/ICNGCI-2026-Conference-Information.docx
@@ -7000,7 +7000,7 @@
               <w:rPr>
                 <w:sz w:val="18"/>
               </w:rPr>
-              <w:t>Dac-Nhuong Le</w:t>
+              <w:t>Dr. Narayan Debnath</w:t>
             </w:r>
           </w:p>
         </w:tc>
@@ -7028,7 +7028,7 @@
               <w:rPr>
                 <w:sz w:val="18"/>
               </w:rPr>
-              <w:t>Haiphong University</w:t>
+              <w:t>Eastern International University</w:t>
             </w:r>
           </w:p>
         </w:tc>
@@ -7044,7 +7044,7 @@
               <w:rPr>
                 <w:sz w:val="18"/>
               </w:rPr>
-              <w:t>Prof. Jafar A. Alzubi</w:t>
+              <w:t>Prof. Bhuvanesh Unhelkar</w:t>
             </w:r>
           </w:p>
         </w:tc>
@@ -7058,7 +7058,7 @@
               <w:rPr>
                 <w:sz w:val="18"/>
               </w:rPr>
-              <w:t>Jordan</w:t>
+              <w:t>USA</w:t>
             </w:r>
           </w:p>
         </w:tc>
@@ -7072,7 +7072,7 @@
               <w:rPr>
                 <w:sz w:val="18"/>
               </w:rPr>
-              <w:t>Al-Balqa Applied University</w:t>
+              <w:t>University of South Florida</w:t>
             </w:r>
           </w:p>
         </w:tc>
@@ -7088,7 +7088,7 @@
               <w:rPr>
                 <w:sz w:val="18"/>
               </w:rPr>
-              <w:t>Fateh Mebarek-Oudina</w:t>
+              <w:t>Dac-Nhuong Le</w:t>
             </w:r>
           </w:p>
         </w:tc>
@@ -7102,7 +7102,7 @@
               <w:rPr>
                 <w:sz w:val="18"/>
               </w:rPr>
-              <w:t>Algeria</w:t>
+              <w:t>Vietnam</w:t>
             </w:r>
           </w:p>
         </w:tc>
@@ -7116,7 +7116,7 @@
               <w:rPr>
                 <w:sz w:val="18"/>
               </w:rPr>
-              <w:t>Skikda University</w:t>
+              <w:t>Haiphong University</w:t>
             </w:r>
           </w:p>
         </w:tc>
@@ -7132,7 +7132,7 @@
               <w:rPr>
                 <w:sz w:val="18"/>
               </w:rPr>
-              <w:t>Yaroslav D. Sergeyev</w:t>
+              <w:t>Prof. Jafar A. Alzubi</w:t>
             </w:r>
           </w:p>
         </w:tc>
@@ -7146,7 +7146,7 @@
               <w:rPr>
                 <w:sz w:val="18"/>
               </w:rPr>
-              <w:t>Italy</w:t>
+              <w:t>Jordan</w:t>
             </w:r>
           </w:p>
         </w:tc>
@@ -7160,7 +7160,7 @@
               <w:rPr>
                 <w:sz w:val="18"/>
               </w:rPr>
-              <w:t>University of Calabria</w:t>
+              <w:t>Al-Balqa Applied University</w:t>
             </w:r>
           </w:p>
         </w:tc>
@@ -7176,7 +7176,7 @@
               <w:rPr>
                 <w:sz w:val="18"/>
               </w:rPr>
-              <w:t>Hari Mohan Rai</w:t>
+              <w:t>Fateh Mebarek-Oudina</w:t>
             </w:r>
           </w:p>
         </w:tc>
@@ -7190,7 +7190,7 @@
               <w:rPr>
                 <w:sz w:val="18"/>
               </w:rPr>
-              <w:t>Kazakhstan</w:t>
+              <w:t>Algeria</w:t>
             </w:r>
           </w:p>
         </w:tc>
@@ -7204,7 +7204,7 @@
               <w:rPr>
                 <w:sz w:val="18"/>
               </w:rPr>
-              <w:t>Nazarbayev University, Astana</w:t>
+              <w:t>Skikda University</w:t>
             </w:r>
           </w:p>
         </w:tc>
@@ -7220,7 +7220,7 @@
               <w:rPr>
                 <w:sz w:val="18"/>
               </w:rPr>
-              <w:t>AKM Bahalul Haque</w:t>
+              <w:t>Yaroslav D. Sergeyev</w:t>
             </w:r>
           </w:p>
         </w:tc>
@@ -7234,7 +7234,7 @@
               <w:rPr>
                 <w:sz w:val="18"/>
               </w:rPr>
-              <w:t>Finland</w:t>
+              <w:t>Italy</w:t>
             </w:r>
           </w:p>
         </w:tc>
@@ -7248,7 +7248,7 @@
               <w:rPr>
                 <w:sz w:val="18"/>
               </w:rPr>
-              <w:t>Abo Akademi University</w:t>
+              <w:t>University of Calabria</w:t>
             </w:r>
           </w:p>
         </w:tc>
@@ -10498,7 +10498,7 @@
               <w:rPr>
                 <w:sz w:val="18"/>
               </w:rPr>
-              <w:t>To be announced</w:t>
+              <w:t>Keith Sherringham</w:t>
             </w:r>
           </w:p>
         </w:tc>
@@ -10526,7 +10526,7 @@
               <w:rPr>
                 <w:sz w:val="18"/>
               </w:rPr>
-              <w:t>To be confirmed</w:t>
+              <w:t>ADT-Partners / Sydney University of Technology</w:t>
             </w:r>
           </w:p>
         </w:tc>
@@ -10542,7 +10542,7 @@
               <w:rPr>
                 <w:sz w:val="18"/>
               </w:rPr>
-              <w:t>To be announced</w:t>
+              <w:t>Yu-Chen Hu</w:t>
             </w:r>
           </w:p>
         </w:tc>
@@ -10570,7 +10570,7 @@
               <w:rPr>
                 <w:sz w:val="18"/>
               </w:rPr>
-              <w:t>To be confirmed</w:t>
+              <w:t>Dept. of Computer Science, Tunghai University</w:t>
             </w:r>
           </w:p>
         </w:tc>
@@ -10586,7 +10586,7 @@
               <w:rPr>
                 <w:sz w:val="18"/>
               </w:rPr>
-              <w:t>To be announced</w:t>
+              <w:t>Samiya Khan</w:t>
             </w:r>
           </w:p>
         </w:tc>
@@ -10614,7 +10614,7 @@
               <w:rPr>
                 <w:sz w:val="18"/>
               </w:rPr>
-              <w:t>To be confirmed</w:t>
+              <w:t>University of Southampton Delhi</w:t>
             </w:r>
           </w:p>
         </w:tc>
@@ -10659,50 +10659,6 @@
                 <w:sz w:val="18"/>
               </w:rPr>
               <w:t>To be confirmed</w:t>
-            </w:r>
-          </w:p>
-        </w:tc>
-      </w:tr>
-      <w:tr>
-        <w:tc>
-          <w:tcPr>
-            <w:tcW w:type="dxa" w:w="2736"/>
-          </w:tcPr>
-          <w:p>
-            <w:r/>
-            <w:r>
-              <w:rPr>
-                <w:sz w:val="18"/>
-              </w:rPr>
-              <w:t>Dr. Keshav Kaushik</w:t>
-            </w:r>
-          </w:p>
-        </w:tc>
-        <w:tc>
-          <w:tcPr>
-            <w:tcW w:type="dxa" w:w="2016"/>
-          </w:tcPr>
-          <w:p>
-            <w:r/>
-            <w:r>
-              <w:rPr>
-                <w:sz w:val="18"/>
-              </w:rPr>
-              <w:t>Technical Program Chair · Associate Professor</w:t>
-            </w:r>
-          </w:p>
-        </w:tc>
-        <w:tc>
-          <w:tcPr>
-            <w:tcW w:type="dxa" w:w="4752"/>
-          </w:tcPr>
-          <w:p>
-            <w:r/>
-            <w:r>
-              <w:rPr>
-                <w:sz w:val="18"/>
-              </w:rPr>
-              <w:t>Department of Computer Science and Engineering, SSCSE, Sharda University, Greater Noida, India</w:t>
             </w:r>
           </w:p>
         </w:tc>

</xml_diff>

<commit_message>
Reorder committee members (IAC women first, NAC by IIT/BHU/other), add text justification, merge fee tables
IAC: women and international members first (Rania Lampou, Ivanna Dronyuk, Pinar Demircioglu, etc.)
NAC: IIT Delhi/Bombay/Kharagpur first, then IIT-BHU (Varanasi), then others
TPC: foreign members first, then Indian

Justify paragraph text across the site (text-align: justify).

Merge Indian and foreign registration fee tables into a single 6-column table
(dual-column headers for INR and USD rates side-by-side), making it easier to
compare domestic and international pricing at a glance.

Co-Authored-By: Claude Sonnet 5 <noreply@anthropic.com>
</commit_message>
<xml_diff>
--- a/assets/downloads/ICNGCI-2026-Conference-Information.docx
+++ b/assets/downloads/ICNGCI-2026-Conference-Information.docx
@@ -4991,7 +4991,7 @@
           <w:color w:val="0A0A0A"/>
           <w:sz w:val="22"/>
         </w:rPr>
-        <w:t>Indian delegates — fees in INR</w:t>
+        <w:t>Registration fees — Indian delegates (INR) and foreign delegates (USD)</w:t>
       </w:r>
     </w:p>
     <w:tbl>
@@ -5001,10 +5001,14 @@
         <w:tblLook w:firstColumn="1" w:firstRow="1" w:lastColumn="0" w:lastRow="0" w:noHBand="0" w:noVBand="1" w:val="04A0"/>
       </w:tblPr>
       <w:tblGrid>
-        <w:gridCol w:w="2412"/>
-        <w:gridCol w:w="2412"/>
-        <w:gridCol w:w="2412"/>
-        <w:gridCol w:w="2412"/>
+        <w:gridCol w:w="1206"/>
+        <w:gridCol w:w="1206"/>
+        <w:gridCol w:w="1206"/>
+        <w:gridCol w:w="1206"/>
+        <w:gridCol w:w="1206"/>
+        <w:gridCol w:w="1206"/>
+        <w:gridCol w:w="1206"/>
+        <w:gridCol w:w="1206"/>
       </w:tblGrid>
       <w:tr>
         <w:tc>
@@ -5037,7 +5041,7 @@
                 <w:color w:val="FFFFFF"/>
                 <w:sz w:val="18"/>
               </w:rPr>
-              <w:t>Early bird until 10 November 2026</w:t>
+              <w:t>India — INR</w:t>
             </w:r>
           </w:p>
         </w:tc>
@@ -5054,7 +5058,7 @@
                 <w:color w:val="FFFFFF"/>
                 <w:sz w:val="18"/>
               </w:rPr>
-              <w:t>Standard until 20 November 2026</w:t>
+              <w:t>Foreign — USD</w:t>
             </w:r>
           </w:p>
         </w:tc>
@@ -5075,6 +5079,74 @@
             </w:r>
           </w:p>
         </w:tc>
+        <w:tc>
+          <w:tcPr>
+            <w:tcW w:type="dxa" w:w="1206"/>
+            <w:shd w:fill="0A0A0A"/>
+          </w:tcPr>
+          <w:p>
+            <w:r/>
+            <w:r>
+              <w:rPr>
+                <w:b/>
+                <w:color w:val="FFFFFF"/>
+                <w:sz w:val="18"/>
+              </w:rPr>
+              <w:t>Early bird until 10 Nov 2026</w:t>
+            </w:r>
+          </w:p>
+        </w:tc>
+        <w:tc>
+          <w:tcPr>
+            <w:tcW w:type="dxa" w:w="1206"/>
+            <w:shd w:fill="0A0A0A"/>
+          </w:tcPr>
+          <w:p>
+            <w:r/>
+            <w:r>
+              <w:rPr>
+                <w:b/>
+                <w:color w:val="FFFFFF"/>
+                <w:sz w:val="18"/>
+              </w:rPr>
+              <w:t>Standard until 20 Nov 2026</w:t>
+            </w:r>
+          </w:p>
+        </w:tc>
+        <w:tc>
+          <w:tcPr>
+            <w:tcW w:type="dxa" w:w="1206"/>
+            <w:shd w:fill="0A0A0A"/>
+          </w:tcPr>
+          <w:p>
+            <w:r/>
+            <w:r>
+              <w:rPr>
+                <w:b/>
+                <w:color w:val="FFFFFF"/>
+                <w:sz w:val="18"/>
+              </w:rPr>
+              <w:t>Early bird until 10 Nov 2026</w:t>
+            </w:r>
+          </w:p>
+        </w:tc>
+        <w:tc>
+          <w:tcPr>
+            <w:tcW w:type="dxa" w:w="1206"/>
+            <w:shd w:fill="0A0A0A"/>
+          </w:tcPr>
+          <w:p>
+            <w:r/>
+            <w:r>
+              <w:rPr>
+                <w:b/>
+                <w:color w:val="FFFFFF"/>
+                <w:sz w:val="18"/>
+              </w:rPr>
+              <w:t>Standard until 20 Nov 2026</w:t>
+            </w:r>
+          </w:p>
+        </w:tc>
       </w:tr>
       <w:tr>
         <w:tc>
@@ -5129,9 +5201,49 @@
               <w:rPr>
                 <w:sz w:val="18"/>
               </w:rPr>
+              <w:t>US$100</w:t>
+            </w:r>
+          </w:p>
+        </w:tc>
+        <w:tc>
+          <w:tcPr>
+            <w:tcW w:type="dxa" w:w="1206"/>
+          </w:tcPr>
+          <w:p>
+            <w:r/>
+            <w:r>
+              <w:rPr>
+                <w:sz w:val="18"/>
+              </w:rPr>
+              <w:t>US$125</w:t>
+            </w:r>
+          </w:p>
+        </w:tc>
+        <w:tc>
+          <w:tcPr>
+            <w:tcW w:type="dxa" w:w="1206"/>
+          </w:tcPr>
+          <w:p>
+            <w:r/>
+            <w:r>
+              <w:rPr>
+                <w:sz w:val="18"/>
+              </w:rPr>
               <w:t>No</w:t>
             </w:r>
           </w:p>
+        </w:tc>
+        <w:tc>
+          <w:tcPr>
+            <w:tcW w:type="dxa" w:w="1206"/>
+          </w:tcPr>
+          <w:p/>
+        </w:tc>
+        <w:tc>
+          <w:tcPr>
+            <w:tcW w:type="dxa" w:w="1206"/>
+          </w:tcPr>
+          <w:p/>
         </w:tc>
       </w:tr>
       <w:tr>
@@ -5187,9 +5299,49 @@
               <w:rPr>
                 <w:sz w:val="18"/>
               </w:rPr>
+              <w:t>US$300</w:t>
+            </w:r>
+          </w:p>
+        </w:tc>
+        <w:tc>
+          <w:tcPr>
+            <w:tcW w:type="dxa" w:w="1206"/>
+          </w:tcPr>
+          <w:p>
+            <w:r/>
+            <w:r>
+              <w:rPr>
+                <w:sz w:val="18"/>
+              </w:rPr>
+              <w:t>US$350</w:t>
+            </w:r>
+          </w:p>
+        </w:tc>
+        <w:tc>
+          <w:tcPr>
+            <w:tcW w:type="dxa" w:w="1206"/>
+          </w:tcPr>
+          <w:p>
+            <w:r/>
+            <w:r>
+              <w:rPr>
+                <w:sz w:val="18"/>
+              </w:rPr>
               <w:t>Yes</w:t>
             </w:r>
           </w:p>
+        </w:tc>
+        <w:tc>
+          <w:tcPr>
+            <w:tcW w:type="dxa" w:w="1206"/>
+          </w:tcPr>
+          <w:p/>
+        </w:tc>
+        <w:tc>
+          <w:tcPr>
+            <w:tcW w:type="dxa" w:w="1206"/>
+          </w:tcPr>
+          <w:p/>
         </w:tc>
       </w:tr>
       <w:tr>
@@ -5245,9 +5397,49 @@
               <w:rPr>
                 <w:sz w:val="18"/>
               </w:rPr>
+              <w:t>US$300</w:t>
+            </w:r>
+          </w:p>
+        </w:tc>
+        <w:tc>
+          <w:tcPr>
+            <w:tcW w:type="dxa" w:w="1206"/>
+          </w:tcPr>
+          <w:p>
+            <w:r/>
+            <w:r>
+              <w:rPr>
+                <w:sz w:val="18"/>
+              </w:rPr>
+              <w:t>US$350</w:t>
+            </w:r>
+          </w:p>
+        </w:tc>
+        <w:tc>
+          <w:tcPr>
+            <w:tcW w:type="dxa" w:w="1206"/>
+          </w:tcPr>
+          <w:p>
+            <w:r/>
+            <w:r>
+              <w:rPr>
+                <w:sz w:val="18"/>
+              </w:rPr>
               <w:t>Yes</w:t>
             </w:r>
           </w:p>
+        </w:tc>
+        <w:tc>
+          <w:tcPr>
+            <w:tcW w:type="dxa" w:w="1206"/>
+          </w:tcPr>
+          <w:p/>
+        </w:tc>
+        <w:tc>
+          <w:tcPr>
+            <w:tcW w:type="dxa" w:w="1206"/>
+          </w:tcPr>
+          <w:p/>
         </w:tc>
       </w:tr>
       <w:tr>
@@ -5303,9 +5495,49 @@
               <w:rPr>
                 <w:sz w:val="18"/>
               </w:rPr>
+              <w:t>US$450</w:t>
+            </w:r>
+          </w:p>
+        </w:tc>
+        <w:tc>
+          <w:tcPr>
+            <w:tcW w:type="dxa" w:w="1206"/>
+          </w:tcPr>
+          <w:p>
+            <w:r/>
+            <w:r>
+              <w:rPr>
+                <w:sz w:val="18"/>
+              </w:rPr>
+              <w:t>US$500</w:t>
+            </w:r>
+          </w:p>
+        </w:tc>
+        <w:tc>
+          <w:tcPr>
+            <w:tcW w:type="dxa" w:w="1206"/>
+          </w:tcPr>
+          <w:p>
+            <w:r/>
+            <w:r>
+              <w:rPr>
+                <w:sz w:val="18"/>
+              </w:rPr>
               <w:t>Yes</w:t>
             </w:r>
           </w:p>
+        </w:tc>
+        <w:tc>
+          <w:tcPr>
+            <w:tcW w:type="dxa" w:w="1206"/>
+          </w:tcPr>
+          <w:p/>
+        </w:tc>
+        <w:tc>
+          <w:tcPr>
+            <w:tcW w:type="dxa" w:w="1206"/>
+          </w:tcPr>
+          <w:p/>
         </w:tc>
       </w:tr>
       <w:tr>
@@ -5361,9 +5593,49 @@
               <w:rPr>
                 <w:sz w:val="18"/>
               </w:rPr>
+              <w:t>US$250</w:t>
+            </w:r>
+          </w:p>
+        </w:tc>
+        <w:tc>
+          <w:tcPr>
+            <w:tcW w:type="dxa" w:w="1206"/>
+          </w:tcPr>
+          <w:p>
+            <w:r/>
+            <w:r>
+              <w:rPr>
+                <w:sz w:val="18"/>
+              </w:rPr>
+              <w:t>US$250</w:t>
+            </w:r>
+          </w:p>
+        </w:tc>
+        <w:tc>
+          <w:tcPr>
+            <w:tcW w:type="dxa" w:w="1206"/>
+          </w:tcPr>
+          <w:p>
+            <w:r/>
+            <w:r>
+              <w:rPr>
+                <w:sz w:val="18"/>
+              </w:rPr>
               <w:t>Yes</w:t>
             </w:r>
           </w:p>
+        </w:tc>
+        <w:tc>
+          <w:tcPr>
+            <w:tcW w:type="dxa" w:w="1206"/>
+          </w:tcPr>
+          <w:p/>
+        </w:tc>
+        <w:tc>
+          <w:tcPr>
+            <w:tcW w:type="dxa" w:w="1206"/>
+          </w:tcPr>
+          <w:p/>
         </w:tc>
       </w:tr>
       <w:tr>
@@ -5419,9 +5691,49 @@
               <w:rPr>
                 <w:sz w:val="18"/>
               </w:rPr>
+              <w:t>US$25</w:t>
+            </w:r>
+          </w:p>
+        </w:tc>
+        <w:tc>
+          <w:tcPr>
+            <w:tcW w:type="dxa" w:w="1206"/>
+          </w:tcPr>
+          <w:p>
+            <w:r/>
+            <w:r>
+              <w:rPr>
+                <w:sz w:val="18"/>
+              </w:rPr>
+              <w:t>US$25</w:t>
+            </w:r>
+          </w:p>
+        </w:tc>
+        <w:tc>
+          <w:tcPr>
+            <w:tcW w:type="dxa" w:w="1206"/>
+          </w:tcPr>
+          <w:p>
+            <w:r/>
+            <w:r>
+              <w:rPr>
+                <w:sz w:val="18"/>
+              </w:rPr>
               <w:t>—</w:t>
             </w:r>
           </w:p>
+        </w:tc>
+        <w:tc>
+          <w:tcPr>
+            <w:tcW w:type="dxa" w:w="1206"/>
+          </w:tcPr>
+          <w:p/>
+        </w:tc>
+        <w:tc>
+          <w:tcPr>
+            <w:tcW w:type="dxa" w:w="1206"/>
+          </w:tcPr>
+          <w:p/>
         </w:tc>
       </w:tr>
       <w:tr>
@@ -5477,9 +5789,49 @@
               <w:rPr>
                 <w:sz w:val="18"/>
               </w:rPr>
+              <w:t>US$40</w:t>
+            </w:r>
+          </w:p>
+        </w:tc>
+        <w:tc>
+          <w:tcPr>
+            <w:tcW w:type="dxa" w:w="1206"/>
+          </w:tcPr>
+          <w:p>
+            <w:r/>
+            <w:r>
+              <w:rPr>
+                <w:sz w:val="18"/>
+              </w:rPr>
+              <w:t>US$40</w:t>
+            </w:r>
+          </w:p>
+        </w:tc>
+        <w:tc>
+          <w:tcPr>
+            <w:tcW w:type="dxa" w:w="1206"/>
+          </w:tcPr>
+          <w:p>
+            <w:r/>
+            <w:r>
+              <w:rPr>
+                <w:sz w:val="18"/>
+              </w:rPr>
               <w:t>No</w:t>
             </w:r>
           </w:p>
+        </w:tc>
+        <w:tc>
+          <w:tcPr>
+            <w:tcW w:type="dxa" w:w="1206"/>
+          </w:tcPr>
+          <w:p/>
+        </w:tc>
+        <w:tc>
+          <w:tcPr>
+            <w:tcW w:type="dxa" w:w="1206"/>
+          </w:tcPr>
+          <w:p/>
         </w:tc>
       </w:tr>
       <w:tr>
@@ -5493,7 +5845,7 @@
               <w:rPr>
                 <w:sz w:val="18"/>
               </w:rPr>
-              <w:t>Fees are indicative and subject to confirmation by the organising committee. GST and other applicable taxes are extra where levied.</w:t>
+              <w:t>Fees are indicative and subject to confirmation by the organising committee. GST and other applicable taxes are extra where levied on Indian payments. Delegates from SAARC and low-income economies may request the concessional rate by writing to the organising secretariat with proof of affiliation.</w:t>
             </w:r>
           </w:p>
         </w:tc>
@@ -5515,487 +5867,27 @@
           </w:tcPr>
           <w:p/>
         </w:tc>
-      </w:tr>
-    </w:tbl>
-    <w:p>
-      <w:pPr>
-        <w:spacing w:after="80"/>
-      </w:pPr>
-    </w:p>
-    <w:p>
-      <w:pPr>
-        <w:spacing w:before="200" w:after="60"/>
-      </w:pPr>
-      <w:r>
-        <w:rPr>
-          <w:b/>
-          <w:i w:val="0"/>
-          <w:color w:val="0A0A0A"/>
-          <w:sz w:val="22"/>
-        </w:rPr>
-        <w:t>Foreign delegates — fees in USD</w:t>
-      </w:r>
-    </w:p>
-    <w:tbl>
-      <w:tblPr>
-        <w:tblStyle w:val="TableGrid"/>
-        <w:tblW w:type="auto" w:w="0"/>
-        <w:tblLook w:firstColumn="1" w:firstRow="1" w:lastColumn="0" w:lastRow="0" w:noHBand="0" w:noVBand="1" w:val="04A0"/>
-      </w:tblPr>
-      <w:tblGrid>
-        <w:gridCol w:w="2412"/>
-        <w:gridCol w:w="2412"/>
-        <w:gridCol w:w="2412"/>
-        <w:gridCol w:w="2412"/>
-      </w:tblGrid>
-      <w:tr>
-        <w:tc>
-          <w:tcPr>
-            <w:tcW w:type="dxa" w:w="3168"/>
-            <w:shd w:fill="0A0A0A"/>
-          </w:tcPr>
-          <w:p>
-            <w:r/>
-            <w:r>
-              <w:rPr>
-                <w:b/>
-                <w:color w:val="FFFFFF"/>
-                <w:sz w:val="18"/>
-              </w:rPr>
-              <w:t>Category</w:t>
-            </w:r>
-          </w:p>
-        </w:tc>
-        <w:tc>
-          <w:tcPr>
-            <w:tcW w:type="dxa" w:w="2160"/>
-            <w:shd w:fill="0A0A0A"/>
-          </w:tcPr>
-          <w:p>
-            <w:r/>
-            <w:r>
-              <w:rPr>
-                <w:b/>
-                <w:color w:val="FFFFFF"/>
-                <w:sz w:val="18"/>
-              </w:rPr>
-              <w:t>Early bird until 10 November 2026</w:t>
-            </w:r>
-          </w:p>
-        </w:tc>
-        <w:tc>
-          <w:tcPr>
-            <w:tcW w:type="dxa" w:w="2160"/>
-            <w:shd w:fill="0A0A0A"/>
-          </w:tcPr>
-          <w:p>
-            <w:r/>
-            <w:r>
-              <w:rPr>
-                <w:b/>
-                <w:color w:val="FFFFFF"/>
-                <w:sz w:val="18"/>
-              </w:rPr>
-              <w:t>Standard until 20 November 2026</w:t>
-            </w:r>
-          </w:p>
-        </w:tc>
-        <w:tc>
-          <w:tcPr>
-            <w:tcW w:type="dxa" w:w="2016"/>
-            <w:shd w:fill="0A0A0A"/>
-          </w:tcPr>
-          <w:p>
-            <w:r/>
-            <w:r>
-              <w:rPr>
-                <w:b/>
-                <w:color w:val="FFFFFF"/>
-                <w:sz w:val="18"/>
-              </w:rPr>
-              <w:t>Presents a paper</w:t>
-            </w:r>
-          </w:p>
-        </w:tc>
-      </w:tr>
-      <w:tr>
-        <w:tc>
-          <w:tcPr>
-            <w:tcW w:type="dxa" w:w="3168"/>
-          </w:tcPr>
-          <w:p>
-            <w:r/>
-            <w:r>
-              <w:rPr>
-                <w:sz w:val="18"/>
-              </w:rPr>
-              <w:t>Attendee / listener</w:t>
-            </w:r>
-          </w:p>
-        </w:tc>
-        <w:tc>
-          <w:tcPr>
-            <w:tcW w:type="dxa" w:w="2160"/>
-          </w:tcPr>
-          <w:p>
-            <w:r/>
-            <w:r>
-              <w:rPr>
-                <w:sz w:val="18"/>
-              </w:rPr>
-              <w:t>US$100</w:t>
-            </w:r>
-          </w:p>
-        </w:tc>
-        <w:tc>
-          <w:tcPr>
-            <w:tcW w:type="dxa" w:w="2160"/>
-          </w:tcPr>
-          <w:p>
-            <w:r/>
-            <w:r>
-              <w:rPr>
-                <w:sz w:val="18"/>
-              </w:rPr>
-              <w:t>US$125</w:t>
-            </w:r>
-          </w:p>
-        </w:tc>
-        <w:tc>
-          <w:tcPr>
-            <w:tcW w:type="dxa" w:w="2016"/>
-          </w:tcPr>
-          <w:p>
-            <w:r/>
-            <w:r>
-              <w:rPr>
-                <w:sz w:val="18"/>
-              </w:rPr>
-              <w:t>No</w:t>
-            </w:r>
-          </w:p>
-        </w:tc>
-      </w:tr>
-      <w:tr>
-        <w:tc>
-          <w:tcPr>
-            <w:tcW w:type="dxa" w:w="3168"/>
-          </w:tcPr>
-          <w:p>
-            <w:r/>
-            <w:r>
-              <w:rPr>
-                <w:sz w:val="18"/>
-              </w:rPr>
-              <w:t>Academician / research scholar / student</w:t>
-            </w:r>
-          </w:p>
-        </w:tc>
-        <w:tc>
-          <w:tcPr>
-            <w:tcW w:type="dxa" w:w="2160"/>
-          </w:tcPr>
-          <w:p>
-            <w:r/>
-            <w:r>
-              <w:rPr>
-                <w:sz w:val="18"/>
-              </w:rPr>
-              <w:t>US$300</w:t>
-            </w:r>
-          </w:p>
-        </w:tc>
-        <w:tc>
-          <w:tcPr>
-            <w:tcW w:type="dxa" w:w="2160"/>
-          </w:tcPr>
-          <w:p>
-            <w:r/>
-            <w:r>
-              <w:rPr>
-                <w:sz w:val="18"/>
-              </w:rPr>
-              <w:t>US$350</w:t>
-            </w:r>
-          </w:p>
-        </w:tc>
-        <w:tc>
-          <w:tcPr>
-            <w:tcW w:type="dxa" w:w="2016"/>
-          </w:tcPr>
-          <w:p>
-            <w:r/>
-            <w:r>
-              <w:rPr>
-                <w:sz w:val="18"/>
-              </w:rPr>
-              <w:t>Yes</w:t>
-            </w:r>
-          </w:p>
-        </w:tc>
-      </w:tr>
-      <w:tr>
-        <w:tc>
-          <w:tcPr>
-            <w:tcW w:type="dxa" w:w="3168"/>
-          </w:tcPr>
-          <w:p>
-            <w:r/>
-            <w:r>
-              <w:rPr>
-                <w:sz w:val="18"/>
-              </w:rPr>
-              <w:t>Industry / corporate</w:t>
-            </w:r>
-          </w:p>
-        </w:tc>
-        <w:tc>
-          <w:tcPr>
-            <w:tcW w:type="dxa" w:w="2160"/>
-          </w:tcPr>
-          <w:p>
-            <w:r/>
-            <w:r>
-              <w:rPr>
-                <w:sz w:val="18"/>
-              </w:rPr>
-              <w:t>US$450</w:t>
-            </w:r>
-          </w:p>
-        </w:tc>
-        <w:tc>
-          <w:tcPr>
-            <w:tcW w:type="dxa" w:w="2160"/>
-          </w:tcPr>
-          <w:p>
-            <w:r/>
-            <w:r>
-              <w:rPr>
-                <w:sz w:val="18"/>
-              </w:rPr>
-              <w:t>US$500</w:t>
-            </w:r>
-          </w:p>
-        </w:tc>
-        <w:tc>
-          <w:tcPr>
-            <w:tcW w:type="dxa" w:w="2016"/>
-          </w:tcPr>
-          <w:p>
-            <w:r/>
-            <w:r>
-              <w:rPr>
-                <w:sz w:val="18"/>
-              </w:rPr>
-              <w:t>Yes</w:t>
-            </w:r>
-          </w:p>
-        </w:tc>
-      </w:tr>
-      <w:tr>
-        <w:tc>
-          <w:tcPr>
-            <w:tcW w:type="dxa" w:w="3168"/>
-          </w:tcPr>
-          <w:p>
-            <w:r/>
-            <w:r>
-              <w:rPr>
-                <w:sz w:val="18"/>
-              </w:rPr>
-              <w:t>Additional paper</w:t>
-            </w:r>
-          </w:p>
-        </w:tc>
-        <w:tc>
-          <w:tcPr>
-            <w:tcW w:type="dxa" w:w="2160"/>
-          </w:tcPr>
-          <w:p>
-            <w:r/>
-            <w:r>
-              <w:rPr>
-                <w:sz w:val="18"/>
-              </w:rPr>
-              <w:t>US$250</w:t>
-            </w:r>
-          </w:p>
-        </w:tc>
-        <w:tc>
-          <w:tcPr>
-            <w:tcW w:type="dxa" w:w="2160"/>
-          </w:tcPr>
-          <w:p>
-            <w:r/>
-            <w:r>
-              <w:rPr>
-                <w:sz w:val="18"/>
-              </w:rPr>
-              <w:t>US$250</w:t>
-            </w:r>
-          </w:p>
-        </w:tc>
-        <w:tc>
-          <w:tcPr>
-            <w:tcW w:type="dxa" w:w="2016"/>
-          </w:tcPr>
-          <w:p>
-            <w:r/>
-            <w:r>
-              <w:rPr>
-                <w:sz w:val="18"/>
-              </w:rPr>
-              <w:t>Yes</w:t>
-            </w:r>
-          </w:p>
-        </w:tc>
-      </w:tr>
-      <w:tr>
-        <w:tc>
-          <w:tcPr>
-            <w:tcW w:type="dxa" w:w="3168"/>
-          </w:tcPr>
-          <w:p>
-            <w:r/>
-            <w:r>
-              <w:rPr>
-                <w:sz w:val="18"/>
-              </w:rPr>
-              <w:t>Extra page</w:t>
-            </w:r>
-          </w:p>
-        </w:tc>
-        <w:tc>
-          <w:tcPr>
-            <w:tcW w:type="dxa" w:w="2160"/>
-          </w:tcPr>
-          <w:p>
-            <w:r/>
-            <w:r>
-              <w:rPr>
-                <w:sz w:val="18"/>
-              </w:rPr>
-              <w:t>US$25</w:t>
-            </w:r>
-          </w:p>
-        </w:tc>
-        <w:tc>
-          <w:tcPr>
-            <w:tcW w:type="dxa" w:w="2160"/>
-          </w:tcPr>
-          <w:p>
-            <w:r/>
-            <w:r>
-              <w:rPr>
-                <w:sz w:val="18"/>
-              </w:rPr>
-              <w:t>US$25</w:t>
-            </w:r>
-          </w:p>
-        </w:tc>
-        <w:tc>
-          <w:tcPr>
-            <w:tcW w:type="dxa" w:w="2016"/>
-          </w:tcPr>
-          <w:p>
-            <w:r/>
-            <w:r>
-              <w:rPr>
-                <w:sz w:val="18"/>
-              </w:rPr>
-              <w:t>—</w:t>
-            </w:r>
-          </w:p>
-        </w:tc>
-      </w:tr>
-      <w:tr>
-        <w:tc>
-          <w:tcPr>
-            <w:tcW w:type="dxa" w:w="3168"/>
-          </w:tcPr>
-          <w:p>
-            <w:r/>
-            <w:r>
-              <w:rPr>
-                <w:sz w:val="18"/>
-              </w:rPr>
-              <w:t>Accompanying person</w:t>
-            </w:r>
-          </w:p>
-        </w:tc>
-        <w:tc>
-          <w:tcPr>
-            <w:tcW w:type="dxa" w:w="2160"/>
-          </w:tcPr>
-          <w:p>
-            <w:r/>
-            <w:r>
-              <w:rPr>
-                <w:sz w:val="18"/>
-              </w:rPr>
-              <w:t>US$40</w:t>
-            </w:r>
-          </w:p>
-        </w:tc>
-        <w:tc>
-          <w:tcPr>
-            <w:tcW w:type="dxa" w:w="2160"/>
-          </w:tcPr>
-          <w:p>
-            <w:r/>
-            <w:r>
-              <w:rPr>
-                <w:sz w:val="18"/>
-              </w:rPr>
-              <w:t>US$40</w:t>
-            </w:r>
-          </w:p>
-        </w:tc>
-        <w:tc>
-          <w:tcPr>
-            <w:tcW w:type="dxa" w:w="2016"/>
-          </w:tcPr>
-          <w:p>
-            <w:r/>
-            <w:r>
-              <w:rPr>
-                <w:sz w:val="18"/>
-              </w:rPr>
-              <w:t>No</w:t>
-            </w:r>
-          </w:p>
-        </w:tc>
-      </w:tr>
-      <w:tr>
-        <w:tc>
-          <w:tcPr>
-            <w:tcW w:type="dxa" w:w="3168"/>
-          </w:tcPr>
-          <w:p>
-            <w:r/>
-            <w:r>
-              <w:rPr>
-                <w:sz w:val="18"/>
-              </w:rPr>
-              <w:t>Delegates from SAARC and low-income economies may request the concessional rate by writing to the organising secretariat with proof of affiliation.</w:t>
-            </w:r>
-          </w:p>
-        </w:tc>
-        <w:tc>
-          <w:tcPr>
-            <w:tcW w:type="dxa" w:w="2160"/>
+        <w:tc>
+          <w:tcPr>
+            <w:tcW w:type="dxa" w:w="1206"/>
           </w:tcPr>
           <w:p/>
         </w:tc>
         <w:tc>
           <w:tcPr>
-            <w:tcW w:type="dxa" w:w="2160"/>
+            <w:tcW w:type="dxa" w:w="1206"/>
           </w:tcPr>
           <w:p/>
         </w:tc>
         <w:tc>
           <w:tcPr>
-            <w:tcW w:type="dxa" w:w="2016"/>
+            <w:tcW w:type="dxa" w:w="1206"/>
+          </w:tcPr>
+          <w:p/>
+        </w:tc>
+        <w:tc>
+          <w:tcPr>
+            <w:tcW w:type="dxa" w:w="1206"/>
           </w:tcPr>
           <w:p/>
         </w:tc>
@@ -7992,7 +7884,7 @@
               <w:rPr>
                 <w:sz w:val="18"/>
               </w:rPr>
-              <w:t>Gautam Srivastava</w:t>
+              <w:t>Dr. Rania Lampou</w:t>
             </w:r>
           </w:p>
         </w:tc>
@@ -8006,7 +7898,7 @@
               <w:rPr>
                 <w:sz w:val="18"/>
               </w:rPr>
-              <w:t>Canada</w:t>
+              <w:t>Greece</w:t>
             </w:r>
           </w:p>
         </w:tc>
@@ -8020,7 +7912,7 @@
               <w:rPr>
                 <w:sz w:val="18"/>
               </w:rPr>
-              <w:t>Brandon University</w:t>
+              <w:t>Ministry of Education, Religious Affairs and Sports, Greece</w:t>
             </w:r>
           </w:p>
         </w:tc>
@@ -8036,7 +7928,7 @@
               <w:rPr>
                 <w:sz w:val="18"/>
               </w:rPr>
-              <w:t>Muhannmad Ajmal Azad</w:t>
+              <w:t>Ivanna Dronyuk</w:t>
             </w:r>
           </w:p>
         </w:tc>
@@ -8050,7 +7942,7 @@
               <w:rPr>
                 <w:sz w:val="18"/>
               </w:rPr>
-              <w:t>United Kingdom</w:t>
+              <w:t>Poland</w:t>
             </w:r>
           </w:p>
         </w:tc>
@@ -8064,7 +7956,7 @@
               <w:rPr>
                 <w:sz w:val="18"/>
               </w:rPr>
-              <w:t>Birmingham City University</w:t>
+              <w:t>Jan Dlugosz University in Czestochowa</w:t>
             </w:r>
           </w:p>
         </w:tc>
@@ -8080,7 +7972,7 @@
               <w:rPr>
                 <w:sz w:val="18"/>
               </w:rPr>
-              <w:t>Rolando Herrero</w:t>
+              <w:t>Pinar Demircioglu</w:t>
             </w:r>
           </w:p>
         </w:tc>
@@ -8094,7 +7986,7 @@
               <w:rPr>
                 <w:sz w:val="18"/>
               </w:rPr>
-              <w:t>USA</w:t>
+              <w:t>Turkiye</w:t>
             </w:r>
           </w:p>
         </w:tc>
@@ -8108,7 +8000,7 @@
               <w:rPr>
                 <w:sz w:val="18"/>
               </w:rPr>
-              <w:t>Northeastern University, University of Massachusetts Lowell</w:t>
+              <w:t>Aydin Adnan Menderes University</w:t>
             </w:r>
           </w:p>
         </w:tc>
@@ -8124,7 +8016,7 @@
               <w:rPr>
                 <w:sz w:val="18"/>
               </w:rPr>
-              <w:t>Sérgio Duarte Correia</w:t>
+              <w:t>NUR AZALIAH ABU BAKAR</w:t>
             </w:r>
           </w:p>
         </w:tc>
@@ -8138,7 +8030,7 @@
               <w:rPr>
                 <w:sz w:val="18"/>
               </w:rPr>
-              <w:t>Portugal</w:t>
+              <w:t>MALAYSIA</w:t>
             </w:r>
           </w:p>
         </w:tc>
@@ -8152,7 +8044,7 @@
               <w:rPr>
                 <w:sz w:val="18"/>
               </w:rPr>
-              <w:t>Portalegre Polytechnic University</w:t>
+              <w:t>UNIVERSITI TEKNOLOGI MALAYSIA</w:t>
             </w:r>
           </w:p>
         </w:tc>
@@ -8168,7 +8060,7 @@
               <w:rPr>
                 <w:sz w:val="18"/>
               </w:rPr>
-              <w:t>Vinícius Lima</w:t>
+              <w:t>Muhannmad Ajmal Azad</w:t>
             </w:r>
           </w:p>
         </w:tc>
@@ -8182,7 +8074,7 @@
               <w:rPr>
                 <w:sz w:val="18"/>
               </w:rPr>
-              <w:t>Portugal</w:t>
+              <w:t>United Kingdom</w:t>
             </w:r>
           </w:p>
         </w:tc>
@@ -8196,7 +8088,7 @@
               <w:rPr>
                 <w:sz w:val="18"/>
               </w:rPr>
-              <w:t>Faculty of Medicine, University of Porto</w:t>
+              <w:t>Birmingham City University</w:t>
             </w:r>
           </w:p>
         </w:tc>
@@ -8212,7 +8104,7 @@
               <w:rPr>
                 <w:sz w:val="18"/>
               </w:rPr>
-              <w:t>Dr. Rania Lampou</w:t>
+              <w:t>Rolando Herrero</w:t>
             </w:r>
           </w:p>
         </w:tc>
@@ -8226,7 +8118,7 @@
               <w:rPr>
                 <w:sz w:val="18"/>
               </w:rPr>
-              <w:t>Greece</w:t>
+              <w:t>USA</w:t>
             </w:r>
           </w:p>
         </w:tc>
@@ -8240,7 +8132,7 @@
               <w:rPr>
                 <w:sz w:val="18"/>
               </w:rPr>
-              <w:t>Ministry of Education, Religious Affairs and Sports, Greece</w:t>
+              <w:t>Northeastern University, University of Massachusetts Lowell</w:t>
             </w:r>
           </w:p>
         </w:tc>
@@ -8256,7 +8148,7 @@
               <w:rPr>
                 <w:sz w:val="18"/>
               </w:rPr>
-              <w:t>Fernando Ortiz-Rodríguez</w:t>
+              <w:t>Sérgio Duarte Correia</w:t>
             </w:r>
           </w:p>
         </w:tc>
@@ -8270,7 +8162,7 @@
               <w:rPr>
                 <w:sz w:val="18"/>
               </w:rPr>
-              <w:t>Mexico</w:t>
+              <w:t>Portugal</w:t>
             </w:r>
           </w:p>
         </w:tc>
@@ -8284,7 +8176,7 @@
               <w:rPr>
                 <w:sz w:val="18"/>
               </w:rPr>
-              <w:t>Universidad Autónoma de Tamaulipas</w:t>
+              <w:t>Portalegre Polytechnic University</w:t>
             </w:r>
           </w:p>
         </w:tc>
@@ -8300,7 +8192,7 @@
               <w:rPr>
                 <w:sz w:val="18"/>
               </w:rPr>
-              <w:t>Faisal Nabi</w:t>
+              <w:t>Vinícius Lima</w:t>
             </w:r>
           </w:p>
         </w:tc>
@@ -8314,7 +8206,7 @@
               <w:rPr>
                 <w:sz w:val="18"/>
               </w:rPr>
-              <w:t>Australia</w:t>
+              <w:t>Portugal</w:t>
             </w:r>
           </w:p>
         </w:tc>
@@ -8328,7 +8220,7 @@
               <w:rPr>
                 <w:sz w:val="18"/>
               </w:rPr>
-              <w:t>University of Southern Queensland (USQ)</w:t>
+              <w:t>Faculty of Medicine, University of Porto</w:t>
             </w:r>
           </w:p>
         </w:tc>
@@ -8344,7 +8236,7 @@
               <w:rPr>
                 <w:sz w:val="18"/>
               </w:rPr>
-              <w:t>Ivanna Dronyuk</w:t>
+              <w:t>Fernando Ortiz-Rodríguez</w:t>
             </w:r>
           </w:p>
         </w:tc>
@@ -8358,7 +8250,7 @@
               <w:rPr>
                 <w:sz w:val="18"/>
               </w:rPr>
-              <w:t>Poland</w:t>
+              <w:t>Mexico</w:t>
             </w:r>
           </w:p>
         </w:tc>
@@ -8372,7 +8264,7 @@
               <w:rPr>
                 <w:sz w:val="18"/>
               </w:rPr>
-              <w:t>Jan Dlugosz University in Czestochowa</w:t>
+              <w:t>Universidad Autónoma de Tamaulipas</w:t>
             </w:r>
           </w:p>
         </w:tc>
@@ -8388,7 +8280,7 @@
               <w:rPr>
                 <w:sz w:val="18"/>
               </w:rPr>
-              <w:t>Muhamad Fazil Ahmad</w:t>
+              <w:t>Faisal Nabi</w:t>
             </w:r>
           </w:p>
         </w:tc>
@@ -8402,7 +8294,7 @@
               <w:rPr>
                 <w:sz w:val="18"/>
               </w:rPr>
-              <w:t>Malaysia</w:t>
+              <w:t>Australia</w:t>
             </w:r>
           </w:p>
         </w:tc>
@@ -8416,7 +8308,7 @@
               <w:rPr>
                 <w:sz w:val="18"/>
               </w:rPr>
-              <w:t>Universiti Sultan Zainal Abidin</w:t>
+              <w:t>University of Southern Queensland (USQ)</w:t>
             </w:r>
           </w:p>
         </w:tc>
@@ -8432,7 +8324,7 @@
               <w:rPr>
                 <w:sz w:val="18"/>
               </w:rPr>
-              <w:t>Noor Zaman Jhanjhi</w:t>
+              <w:t>Muhamad Fazil Ahmad</w:t>
             </w:r>
           </w:p>
         </w:tc>
@@ -8460,7 +8352,7 @@
               <w:rPr>
                 <w:sz w:val="18"/>
               </w:rPr>
-              <w:t>Sunway University</w:t>
+              <w:t>Universiti Sultan Zainal Abidin</w:t>
             </w:r>
           </w:p>
         </w:tc>
@@ -8476,7 +8368,7 @@
               <w:rPr>
                 <w:sz w:val="18"/>
               </w:rPr>
-              <w:t>Pinar Demircioglu</w:t>
+              <w:t>Noor Zaman Jhanjhi</w:t>
             </w:r>
           </w:p>
         </w:tc>
@@ -8490,7 +8382,7 @@
               <w:rPr>
                 <w:sz w:val="18"/>
               </w:rPr>
-              <w:t>Turkiye</w:t>
+              <w:t>Malaysia</w:t>
             </w:r>
           </w:p>
         </w:tc>
@@ -8504,7 +8396,7 @@
               <w:rPr>
                 <w:sz w:val="18"/>
               </w:rPr>
-              <w:t>Aydin Adnan Menderes University</w:t>
+              <w:t>Sunway University</w:t>
             </w:r>
           </w:p>
         </w:tc>
@@ -8872,7 +8764,7 @@
               <w:rPr>
                 <w:sz w:val="18"/>
               </w:rPr>
-              <w:t>NUR AZALIAH ABU BAKAR</w:t>
+              <w:t>Mohd Anas Wajid</w:t>
             </w:r>
           </w:p>
         </w:tc>
@@ -8886,7 +8778,7 @@
               <w:rPr>
                 <w:sz w:val="18"/>
               </w:rPr>
-              <w:t>MALAYSIA</w:t>
+              <w:t>Mexico</w:t>
             </w:r>
           </w:p>
         </w:tc>
@@ -8900,7 +8792,7 @@
               <w:rPr>
                 <w:sz w:val="18"/>
               </w:rPr>
-              <w:t>UNIVERSITI TEKNOLOGI MALAYSIA</w:t>
+              <w:t>Tecnológico de Monterrey, Mexico</w:t>
             </w:r>
           </w:p>
         </w:tc>
@@ -8916,7 +8808,7 @@
               <w:rPr>
                 <w:sz w:val="18"/>
               </w:rPr>
-              <w:t>Mohd Anas Wajid</w:t>
+              <w:t>Gautam Srivastava</w:t>
             </w:r>
           </w:p>
         </w:tc>
@@ -8930,7 +8822,7 @@
               <w:rPr>
                 <w:sz w:val="18"/>
               </w:rPr>
-              <w:t>Mexico</w:t>
+              <w:t>Canada</w:t>
             </w:r>
           </w:p>
         </w:tc>
@@ -8944,7 +8836,7 @@
               <w:rPr>
                 <w:sz w:val="18"/>
               </w:rPr>
-              <w:t>Tecnológico de Monterrey, Mexico</w:t>
+              <w:t>Brandon University</w:t>
             </w:r>
           </w:p>
         </w:tc>
@@ -9044,7 +8936,7 @@
               <w:rPr>
                 <w:sz w:val="18"/>
               </w:rPr>
-              <w:t>Dr. Smrity Dwivedi</w:t>
+              <w:t>Professor R.K. Shyamasundar</w:t>
             </w:r>
           </w:p>
         </w:tc>
@@ -9072,7 +8964,7 @@
               <w:rPr>
                 <w:sz w:val="18"/>
               </w:rPr>
-              <w:t>Indian Institute of Technology (BHU), Varanasi</w:t>
+              <w:t>IIT Bombay</w:t>
             </w:r>
           </w:p>
         </w:tc>
@@ -9088,7 +8980,7 @@
               <w:rPr>
                 <w:sz w:val="18"/>
               </w:rPr>
-              <w:t>Dr. R. Mahanty</w:t>
+              <w:t>Dr. Chittaranjan Mandal</w:t>
             </w:r>
           </w:p>
         </w:tc>
@@ -9116,7 +9008,7 @@
               <w:rPr>
                 <w:sz w:val="18"/>
               </w:rPr>
-              <w:t>Indian Institute of Technology (BHU)</w:t>
+              <w:t>IIT Kharagpur</w:t>
             </w:r>
           </w:p>
         </w:tc>
@@ -9132,7 +9024,7 @@
               <w:rPr>
                 <w:sz w:val="18"/>
               </w:rPr>
-              <w:t>Professor R.K. Shyamasundar</w:t>
+              <w:t>Dr. Bhim Singh</w:t>
             </w:r>
           </w:p>
         </w:tc>
@@ -9160,7 +9052,7 @@
               <w:rPr>
                 <w:sz w:val="18"/>
               </w:rPr>
-              <w:t>IIT Bombay</w:t>
+              <w:t>Indian Institute of Technology, Delhi</w:t>
             </w:r>
           </w:p>
         </w:tc>
@@ -9176,7 +9068,7 @@
               <w:rPr>
                 <w:sz w:val="18"/>
               </w:rPr>
-              <w:t>Dr. D. P. Vidyarthi</w:t>
+              <w:t>Dr. Chakradhar Reddy. Chandupatla</w:t>
             </w:r>
           </w:p>
         </w:tc>
@@ -9190,7 +9082,7 @@
               <w:rPr>
                 <w:sz w:val="18"/>
               </w:rPr>
-              <w:t>INDIA</w:t>
+              <w:t>India</w:t>
             </w:r>
           </w:p>
         </w:tc>
@@ -9204,7 +9096,7 @@
               <w:rPr>
                 <w:sz w:val="18"/>
               </w:rPr>
-              <w:t>Jawaharlal Nehru University, New Delhi</w:t>
+              <w:t>IIT Ropar</w:t>
             </w:r>
           </w:p>
         </w:tc>
@@ -9220,7 +9112,7 @@
               <w:rPr>
                 <w:sz w:val="18"/>
               </w:rPr>
-              <w:t>Prof. Amit Prakash Singh</w:t>
+              <w:t>Dr. Smrity Dwivedi</w:t>
             </w:r>
           </w:p>
         </w:tc>
@@ -9248,7 +9140,7 @@
               <w:rPr>
                 <w:sz w:val="18"/>
               </w:rPr>
-              <w:t>Guru Gobind Singh Indraprastha University, Delhi</w:t>
+              <w:t>Indian Institute of Technology (BHU), Varanasi</w:t>
             </w:r>
           </w:p>
         </w:tc>
@@ -9264,7 +9156,7 @@
               <w:rPr>
                 <w:sz w:val="18"/>
               </w:rPr>
-              <w:t>Prof. (Dr.) Nanhay Singh</w:t>
+              <w:t>Dr. R. Mahanty</w:t>
             </w:r>
           </w:p>
         </w:tc>
@@ -9292,7 +9184,7 @@
               <w:rPr>
                 <w:sz w:val="18"/>
               </w:rPr>
-              <w:t>Netaji Subhas University of Technology East Campus, New Delhi</w:t>
+              <w:t>Indian Institute of Technology (BHU)</w:t>
             </w:r>
           </w:p>
         </w:tc>
@@ -9308,7 +9200,7 @@
               <w:rPr>
                 <w:sz w:val="18"/>
               </w:rPr>
-              <w:t>Dr. Satish Chand</w:t>
+              <w:t>Dr. R. K. Saket</w:t>
             </w:r>
           </w:p>
         </w:tc>
@@ -9336,7 +9228,7 @@
               <w:rPr>
                 <w:sz w:val="18"/>
               </w:rPr>
-              <w:t>Jawaharlal Nehru University, New Delhi</w:t>
+              <w:t>Indian Institute of Technology (BHU), Varanasi (UP)</w:t>
             </w:r>
           </w:p>
         </w:tc>
@@ -9352,7 +9244,7 @@
               <w:rPr>
                 <w:sz w:val="18"/>
               </w:rPr>
-              <w:t>Dr. Chittaranjan Mandal</w:t>
+              <w:t>Dr. R. K. Srivastava</w:t>
             </w:r>
           </w:p>
         </w:tc>
@@ -9380,7 +9272,7 @@
               <w:rPr>
                 <w:sz w:val="18"/>
               </w:rPr>
-              <w:t>IIT Kharagpur</w:t>
+              <w:t>Indian Institute of Technology, Banaras Hindu University, Varanasi</w:t>
             </w:r>
           </w:p>
         </w:tc>
@@ -9396,7 +9288,7 @@
               <w:rPr>
                 <w:sz w:val="18"/>
               </w:rPr>
-              <w:t>Prof. Sushama Nagpal</w:t>
+              <w:t>Prof. N. S. Rajput</w:t>
             </w:r>
           </w:p>
         </w:tc>
@@ -9424,7 +9316,7 @@
               <w:rPr>
                 <w:sz w:val="18"/>
               </w:rPr>
-              <w:t>Netaji Subhas University of Technology, New Delhi</w:t>
+              <w:t>Indian Institute of Technology (Banaras Hindu University), Varanasi</w:t>
             </w:r>
           </w:p>
         </w:tc>
@@ -9440,7 +9332,7 @@
               <w:rPr>
                 <w:sz w:val="18"/>
               </w:rPr>
-              <w:t>Dr. Jawwad Sami Ur Rahman</w:t>
+              <w:t>Dr. Oppili Prasad L</w:t>
             </w:r>
           </w:p>
         </w:tc>
@@ -9454,7 +9346,7 @@
               <w:rPr>
                 <w:sz w:val="18"/>
               </w:rPr>
-              <w:t>Pakistan</w:t>
+              <w:t>India</w:t>
             </w:r>
           </w:p>
         </w:tc>
@@ -9468,7 +9360,7 @@
               <w:rPr>
                 <w:sz w:val="18"/>
               </w:rPr>
-              <w:t>Riphah International University</w:t>
+              <w:t>Indian Institute of Technology (BHU), Varanasi</w:t>
             </w:r>
           </w:p>
         </w:tc>
@@ -9484,7 +9376,7 @@
               <w:rPr>
                 <w:sz w:val="18"/>
               </w:rPr>
-              <w:t>Prof. Anurag Jain</w:t>
+              <w:t>Dr. Naveen Yalla</w:t>
             </w:r>
           </w:p>
         </w:tc>
@@ -9512,7 +9404,7 @@
               <w:rPr>
                 <w:sz w:val="18"/>
               </w:rPr>
-              <w:t>Guru Gobind Singh Indraprastha University, New Delhi</w:t>
+              <w:t>Indian Institute of Technology (BHU) Varanasi</w:t>
             </w:r>
           </w:p>
         </w:tc>
@@ -9528,7 +9420,7 @@
               <w:rPr>
                 <w:sz w:val="18"/>
               </w:rPr>
-              <w:t>Dr. R. K. Saket</w:t>
+              <w:t>Prof. Kalpana Chaudhary</w:t>
             </w:r>
           </w:p>
         </w:tc>
@@ -9556,7 +9448,7 @@
               <w:rPr>
                 <w:sz w:val="18"/>
               </w:rPr>
-              <w:t>Indian Institute of Technology (BHU), Varanasi (UP)</w:t>
+              <w:t>Indian Institute of Technology (BHU) Varanasi</w:t>
             </w:r>
           </w:p>
         </w:tc>
@@ -9572,7 +9464,7 @@
               <w:rPr>
                 <w:sz w:val="18"/>
               </w:rPr>
-              <w:t>Dr. R. K. Srivastava</w:t>
+              <w:t>Dr. D. P. Vidyarthi</w:t>
             </w:r>
           </w:p>
         </w:tc>
@@ -9586,7 +9478,7 @@
               <w:rPr>
                 <w:sz w:val="18"/>
               </w:rPr>
-              <w:t>India</w:t>
+              <w:t>INDIA</w:t>
             </w:r>
           </w:p>
         </w:tc>
@@ -9600,7 +9492,7 @@
               <w:rPr>
                 <w:sz w:val="18"/>
               </w:rPr>
-              <w:t>Indian Institute of Technology, Banaras Hindu University, Varanasi</w:t>
+              <w:t>Jawaharlal Nehru University, New Delhi</w:t>
             </w:r>
           </w:p>
         </w:tc>
@@ -9616,7 +9508,7 @@
               <w:rPr>
                 <w:sz w:val="18"/>
               </w:rPr>
-              <w:t>Prof. N. S. Rajput</w:t>
+              <w:t>Prof. Amit Prakash Singh</w:t>
             </w:r>
           </w:p>
         </w:tc>
@@ -9644,7 +9536,7 @@
               <w:rPr>
                 <w:sz w:val="18"/>
               </w:rPr>
-              <w:t>Indian Institute of Technology (Banaras Hindu University), Varanasi</w:t>
+              <w:t>Guru Gobind Singh Indraprastha University, Delhi</w:t>
             </w:r>
           </w:p>
         </w:tc>
@@ -9660,7 +9552,7 @@
               <w:rPr>
                 <w:sz w:val="18"/>
               </w:rPr>
-              <w:t>Dr. Oppili Prasad L</w:t>
+              <w:t>Prof. (Dr.) Nanhay Singh</w:t>
             </w:r>
           </w:p>
         </w:tc>
@@ -9688,7 +9580,7 @@
               <w:rPr>
                 <w:sz w:val="18"/>
               </w:rPr>
-              <w:t>Indian Institute of Technology (BHU), Varanasi</w:t>
+              <w:t>Netaji Subhas University of Technology East Campus, New Delhi</w:t>
             </w:r>
           </w:p>
         </w:tc>
@@ -9704,7 +9596,7 @@
               <w:rPr>
                 <w:sz w:val="18"/>
               </w:rPr>
-              <w:t>Dr. Naveen Yalla</w:t>
+              <w:t>Dr. Satish Chand</w:t>
             </w:r>
           </w:p>
         </w:tc>
@@ -9732,7 +9624,7 @@
               <w:rPr>
                 <w:sz w:val="18"/>
               </w:rPr>
-              <w:t>Indian Institute of Technology (BHU) Varanasi</w:t>
+              <w:t>Jawaharlal Nehru University, New Delhi</w:t>
             </w:r>
           </w:p>
         </w:tc>
@@ -9748,7 +9640,7 @@
               <w:rPr>
                 <w:sz w:val="18"/>
               </w:rPr>
-              <w:t>Prof. Kalpana Chaudhary</w:t>
+              <w:t>Prof. Sushama Nagpal</w:t>
             </w:r>
           </w:p>
         </w:tc>
@@ -9776,7 +9668,7 @@
               <w:rPr>
                 <w:sz w:val="18"/>
               </w:rPr>
-              <w:t>Indian Institute of Technology (BHU) Varanasi</w:t>
+              <w:t>Netaji Subhas University of Technology, New Delhi</w:t>
             </w:r>
           </w:p>
         </w:tc>
@@ -9792,7 +9684,7 @@
               <w:rPr>
                 <w:sz w:val="18"/>
               </w:rPr>
-              <w:t>Dr. Bhim Singh</w:t>
+              <w:t>Dr. Jawwad Sami Ur Rahman</w:t>
             </w:r>
           </w:p>
         </w:tc>
@@ -9806,7 +9698,7 @@
               <w:rPr>
                 <w:sz w:val="18"/>
               </w:rPr>
-              <w:t>India</w:t>
+              <w:t>Pakistan</w:t>
             </w:r>
           </w:p>
         </w:tc>
@@ -9820,7 +9712,7 @@
               <w:rPr>
                 <w:sz w:val="18"/>
               </w:rPr>
-              <w:t>Indian Institute of Technology, Delhi</w:t>
+              <w:t>Riphah International University</w:t>
             </w:r>
           </w:p>
         </w:tc>
@@ -9836,7 +9728,7 @@
               <w:rPr>
                 <w:sz w:val="18"/>
               </w:rPr>
-              <w:t>Dr. Chakradhar Reddy. Chandupatla</w:t>
+              <w:t>Prof. Anurag Jain</w:t>
             </w:r>
           </w:p>
         </w:tc>
@@ -9864,7 +9756,7 @@
               <w:rPr>
                 <w:sz w:val="18"/>
               </w:rPr>
-              <w:t>IIT Ropar</w:t>
+              <w:t>Guru Gobind Singh Indraprastha University, New Delhi</w:t>
             </w:r>
           </w:p>
         </w:tc>
@@ -10846,7 +10738,7 @@
               <w:rPr>
                 <w:sz w:val="18"/>
               </w:rPr>
-              <w:t>Ekta Maini</w:t>
+              <w:t>HENRY CHIMA Chima UKWUOMA</w:t>
             </w:r>
           </w:p>
         </w:tc>
@@ -10860,7 +10752,7 @@
               <w:rPr>
                 <w:sz w:val="18"/>
               </w:rPr>
-              <w:t>India</w:t>
+              <w:t>Nigeria</w:t>
             </w:r>
           </w:p>
         </w:tc>
@@ -10874,7 +10766,7 @@
               <w:rPr>
                 <w:sz w:val="18"/>
               </w:rPr>
-              <w:t>Amity University Hyderabad</w:t>
+              <w:t>NIPSS kuru, Nigeria</w:t>
             </w:r>
           </w:p>
         </w:tc>
@@ -10890,7 +10782,7 @@
               <w:rPr>
                 <w:sz w:val="18"/>
               </w:rPr>
-              <w:t>Prof. Anuja Arora</w:t>
+              <w:t>Mehmet Recep Bozkurt</w:t>
             </w:r>
           </w:p>
         </w:tc>
@@ -10904,7 +10796,7 @@
               <w:rPr>
                 <w:sz w:val="18"/>
               </w:rPr>
-              <w:t>India</w:t>
+              <w:t>Turkiye</w:t>
             </w:r>
           </w:p>
         </w:tc>
@@ -10918,7 +10810,7 @@
               <w:rPr>
                 <w:sz w:val="18"/>
               </w:rPr>
-              <w:t>Jaypee Institute of Information Technology</w:t>
+              <w:t>Sakarya University</w:t>
             </w:r>
           </w:p>
         </w:tc>
@@ -10934,7 +10826,7 @@
               <w:rPr>
                 <w:sz w:val="18"/>
               </w:rPr>
-              <w:t>Sannasi Chakravarthy S R</w:t>
+              <w:t>Shriya Misra</w:t>
             </w:r>
           </w:p>
         </w:tc>
@@ -10948,7 +10840,7 @@
               <w:rPr>
                 <w:sz w:val="18"/>
               </w:rPr>
-              <w:t>India</w:t>
+              <w:t>USA</w:t>
             </w:r>
           </w:p>
         </w:tc>
@@ -10962,7 +10854,7 @@
               <w:rPr>
                 <w:sz w:val="18"/>
               </w:rPr>
-              <w:t>Bannari Amman Institute of Technology</w:t>
+              <w:t>Independent Researcher</w:t>
             </w:r>
           </w:p>
         </w:tc>
@@ -10978,7 +10870,7 @@
               <w:rPr>
                 <w:sz w:val="18"/>
               </w:rPr>
-              <w:t>Dr. R. Manikandan</w:t>
+              <w:t>Prof Dr Arab Naz</w:t>
             </w:r>
           </w:p>
         </w:tc>
@@ -10992,7 +10884,7 @@
               <w:rPr>
                 <w:sz w:val="18"/>
               </w:rPr>
-              <w:t>India</w:t>
+              <w:t>Pakistan</w:t>
             </w:r>
           </w:p>
         </w:tc>
@@ -11006,7 +10898,7 @@
               <w:rPr>
                 <w:sz w:val="18"/>
               </w:rPr>
-              <w:t>School of Computing, SASTRA Deemed University</w:t>
+              <w:t>University of Malakand, Pakistan</w:t>
             </w:r>
           </w:p>
         </w:tc>
@@ -11022,7 +10914,7 @@
               <w:rPr>
                 <w:sz w:val="18"/>
               </w:rPr>
-              <w:t>Dr. Avijit Kumar Chaudhuri</w:t>
+              <w:t>Qasem Abu Al-Haija</w:t>
             </w:r>
           </w:p>
         </w:tc>
@@ -11036,7 +10928,7 @@
               <w:rPr>
                 <w:sz w:val="18"/>
               </w:rPr>
-              <w:t>India</w:t>
+              <w:t>Jordan</w:t>
             </w:r>
           </w:p>
         </w:tc>
@@ -11050,7 +10942,7 @@
               <w:rPr>
                 <w:sz w:val="18"/>
               </w:rPr>
-              <w:t>Brainware University</w:t>
+              <w:t>Jordan University of Science and Technology</w:t>
             </w:r>
           </w:p>
         </w:tc>
@@ -11066,7 +10958,7 @@
               <w:rPr>
                 <w:sz w:val="18"/>
               </w:rPr>
-              <w:t>Dr. Nishant Doshi</w:t>
+              <w:t>Kevin M. Rivera, Ph.D.</w:t>
             </w:r>
           </w:p>
         </w:tc>
@@ -11080,7 +10972,7 @@
               <w:rPr>
                 <w:sz w:val="18"/>
               </w:rPr>
-              <w:t>India</w:t>
+              <w:t>Malta</w:t>
             </w:r>
           </w:p>
         </w:tc>
@@ -11094,7 +10986,7 @@
               <w:rPr>
                 <w:sz w:val="18"/>
               </w:rPr>
-              <w:t>Pandit Deendayal Energy University (PDEU), Gandhinagar</w:t>
+              <w:t>Yhank Institute</w:t>
             </w:r>
           </w:p>
         </w:tc>
@@ -11110,7 +11002,7 @@
               <w:rPr>
                 <w:sz w:val="18"/>
               </w:rPr>
-              <w:t>Janmenjoy Nayak</w:t>
+              <w:t>Ilham Laabab</w:t>
             </w:r>
           </w:p>
         </w:tc>
@@ -11124,7 +11016,7 @@
               <w:rPr>
                 <w:sz w:val="18"/>
               </w:rPr>
-              <w:t>India</w:t>
+              <w:t>Morocco</w:t>
             </w:r>
           </w:p>
         </w:tc>
@@ -11138,7 +11030,7 @@
               <w:rPr>
                 <w:sz w:val="18"/>
               </w:rPr>
-              <w:t>MSCB University, Odisha</w:t>
+              <w:t>Sidi Mohamed Ben Abdellah University, Fez. Morocco</w:t>
             </w:r>
           </w:p>
         </w:tc>
@@ -11154,7 +11046,7 @@
               <w:rPr>
                 <w:sz w:val="18"/>
               </w:rPr>
-              <w:t>Dr. Kingsy Grace R</w:t>
+              <w:t>Ekta Maini</w:t>
             </w:r>
           </w:p>
         </w:tc>
@@ -11182,7 +11074,7 @@
               <w:rPr>
                 <w:sz w:val="18"/>
               </w:rPr>
-              <w:t>Sri Ramakrishna Engineering College</w:t>
+              <w:t>Amity University Hyderabad</w:t>
             </w:r>
           </w:p>
         </w:tc>
@@ -11198,7 +11090,7 @@
               <w:rPr>
                 <w:sz w:val="18"/>
               </w:rPr>
-              <w:t>Dr. Manvi Breja</w:t>
+              <w:t>Prof. Anuja Arora</w:t>
             </w:r>
           </w:p>
         </w:tc>
@@ -11226,7 +11118,7 @@
               <w:rPr>
                 <w:sz w:val="18"/>
               </w:rPr>
-              <w:t>The NorthCap University, Gurugram</w:t>
+              <w:t>Jaypee Institute of Information Technology</w:t>
             </w:r>
           </w:p>
         </w:tc>
@@ -11242,7 +11134,7 @@
               <w:rPr>
                 <w:sz w:val="18"/>
               </w:rPr>
-              <w:t>Prof. Sumit Gupta</w:t>
+              <w:t>Sannasi Chakravarthy S R</w:t>
             </w:r>
           </w:p>
         </w:tc>
@@ -11270,7 +11162,7 @@
               <w:rPr>
                 <w:sz w:val="18"/>
               </w:rPr>
-              <w:t>Academy of Technology</w:t>
+              <w:t>Bannari Amman Institute of Technology</w:t>
             </w:r>
           </w:p>
         </w:tc>
@@ -11286,7 +11178,7 @@
               <w:rPr>
                 <w:sz w:val="18"/>
               </w:rPr>
-              <w:t>Dr. Saroj Koul</w:t>
+              <w:t>Dr. R. Manikandan</w:t>
             </w:r>
           </w:p>
         </w:tc>
@@ -11314,7 +11206,7 @@
               <w:rPr>
                 <w:sz w:val="18"/>
               </w:rPr>
-              <w:t>O.P. Jindal Global University</w:t>
+              <w:t>School of Computing, SASTRA Deemed University</w:t>
             </w:r>
           </w:p>
         </w:tc>
@@ -11330,7 +11222,7 @@
               <w:rPr>
                 <w:sz w:val="18"/>
               </w:rPr>
-              <w:t>HENRY CHIMA Chima UKWUOMA</w:t>
+              <w:t>Dr. Avijit Kumar Chaudhuri</w:t>
             </w:r>
           </w:p>
         </w:tc>
@@ -11344,7 +11236,7 @@
               <w:rPr>
                 <w:sz w:val="18"/>
               </w:rPr>
-              <w:t>Nigeria</w:t>
+              <w:t>India</w:t>
             </w:r>
           </w:p>
         </w:tc>
@@ -11358,7 +11250,7 @@
               <w:rPr>
                 <w:sz w:val="18"/>
               </w:rPr>
-              <w:t>NIPSS kuru, Nigeria</w:t>
+              <w:t>Brainware University</w:t>
             </w:r>
           </w:p>
         </w:tc>
@@ -11374,7 +11266,7 @@
               <w:rPr>
                 <w:sz w:val="18"/>
               </w:rPr>
-              <w:t>Mehmet Recep Bozkurt</w:t>
+              <w:t>Dr. Nishant Doshi</w:t>
             </w:r>
           </w:p>
         </w:tc>
@@ -11388,7 +11280,7 @@
               <w:rPr>
                 <w:sz w:val="18"/>
               </w:rPr>
-              <w:t>Turkiye</w:t>
+              <w:t>India</w:t>
             </w:r>
           </w:p>
         </w:tc>
@@ -11402,7 +11294,7 @@
               <w:rPr>
                 <w:sz w:val="18"/>
               </w:rPr>
-              <w:t>Sakarya University</w:t>
+              <w:t>Pandit Deendayal Energy University (PDEU), Gandhinagar</w:t>
             </w:r>
           </w:p>
         </w:tc>
@@ -11418,7 +11310,7 @@
               <w:rPr>
                 <w:sz w:val="18"/>
               </w:rPr>
-              <w:t>Shriya Misra</w:t>
+              <w:t>Janmenjoy Nayak</w:t>
             </w:r>
           </w:p>
         </w:tc>
@@ -11432,7 +11324,7 @@
               <w:rPr>
                 <w:sz w:val="18"/>
               </w:rPr>
-              <w:t>USA</w:t>
+              <w:t>India</w:t>
             </w:r>
           </w:p>
         </w:tc>
@@ -11446,7 +11338,7 @@
               <w:rPr>
                 <w:sz w:val="18"/>
               </w:rPr>
-              <w:t>Independent Researcher</w:t>
+              <w:t>MSCB University, Odisha</w:t>
             </w:r>
           </w:p>
         </w:tc>
@@ -11462,7 +11354,7 @@
               <w:rPr>
                 <w:sz w:val="18"/>
               </w:rPr>
-              <w:t>Prof Dr Arab Naz</w:t>
+              <w:t>Dr. Kingsy Grace R</w:t>
             </w:r>
           </w:p>
         </w:tc>
@@ -11476,7 +11368,7 @@
               <w:rPr>
                 <w:sz w:val="18"/>
               </w:rPr>
-              <w:t>Pakistan</w:t>
+              <w:t>India</w:t>
             </w:r>
           </w:p>
         </w:tc>
@@ -11490,7 +11382,7 @@
               <w:rPr>
                 <w:sz w:val="18"/>
               </w:rPr>
-              <w:t>University of Malakand, Pakistan</w:t>
+              <w:t>Sri Ramakrishna Engineering College</w:t>
             </w:r>
           </w:p>
         </w:tc>
@@ -11506,7 +11398,7 @@
               <w:rPr>
                 <w:sz w:val="18"/>
               </w:rPr>
-              <w:t>Qasem Abu Al-Haija</w:t>
+              <w:t>Dr. Manvi Breja</w:t>
             </w:r>
           </w:p>
         </w:tc>
@@ -11520,7 +11412,7 @@
               <w:rPr>
                 <w:sz w:val="18"/>
               </w:rPr>
-              <w:t>Jordan</w:t>
+              <w:t>India</w:t>
             </w:r>
           </w:p>
         </w:tc>
@@ -11534,7 +11426,7 @@
               <w:rPr>
                 <w:sz w:val="18"/>
               </w:rPr>
-              <w:t>Jordan University of Science and Technology</w:t>
+              <w:t>The NorthCap University, Gurugram</w:t>
             </w:r>
           </w:p>
         </w:tc>
@@ -11550,7 +11442,7 @@
               <w:rPr>
                 <w:sz w:val="18"/>
               </w:rPr>
-              <w:t>Kevin M. Rivera, Ph.D.</w:t>
+              <w:t>Prof. Sumit Gupta</w:t>
             </w:r>
           </w:p>
         </w:tc>
@@ -11564,7 +11456,7 @@
               <w:rPr>
                 <w:sz w:val="18"/>
               </w:rPr>
-              <w:t>Malta</w:t>
+              <w:t>India</w:t>
             </w:r>
           </w:p>
         </w:tc>
@@ -11578,7 +11470,7 @@
               <w:rPr>
                 <w:sz w:val="18"/>
               </w:rPr>
-              <w:t>Yhank Institute</w:t>
+              <w:t>Academy of Technology</w:t>
             </w:r>
           </w:p>
         </w:tc>
@@ -11594,7 +11486,7 @@
               <w:rPr>
                 <w:sz w:val="18"/>
               </w:rPr>
-              <w:t>Ilham Laabab</w:t>
+              <w:t>Dr. Saroj Koul</w:t>
             </w:r>
           </w:p>
         </w:tc>
@@ -11608,7 +11500,7 @@
               <w:rPr>
                 <w:sz w:val="18"/>
               </w:rPr>
-              <w:t>Morocco</w:t>
+              <w:t>India</w:t>
             </w:r>
           </w:p>
         </w:tc>
@@ -11622,7 +11514,7 @@
               <w:rPr>
                 <w:sz w:val="18"/>
               </w:rPr>
-              <w:t>Sidi Mohamed Ben Abdellah University, Fez. Morocco</w:t>
+              <w:t>O.P. Jindal Global University</w:t>
             </w:r>
           </w:p>
         </w:tc>

</xml_diff>